<commit_message>
Add Dockerfile for Koyeb deployment
</commit_message>
<xml_diff>
--- a/soal matematika/Kelas XI/Fungsi Komposisi dan Fungsi Invers/Kunci Jawaban essay.docx
+++ b/soal matematika/Kelas XI/Fungsi Komposisi dan Fungsi Invers/Kunci Jawaban essay.docx
@@ -511,11 +511,17 @@
         </w:rPr>
       </w:pPr>
       <m:oMath>
+        <m:r>
+          <w:rPr>
+            <w:rFonts w:ascii="Cambria Math" w:eastAsiaTheme="minorEastAsia" w:hAnsi="Cambria Math"/>
+          </w:rPr>
+          <m:t>f</m:t>
+        </m:r>
         <m:d>
           <m:dPr>
             <m:ctrlPr>
               <w:rPr>
-                <w:rFonts w:ascii="Cambria Math" w:hAnsi="Cambria Math"/>
+                <w:rFonts w:ascii="Cambria Math" w:eastAsiaTheme="minorEastAsia" w:hAnsi="Cambria Math"/>
                 <w:i/>
               </w:rPr>
             </m:ctrlPr>
@@ -523,70 +529,10 @@
           <m:e>
             <m:r>
               <w:rPr>
-                <w:rFonts w:ascii="Cambria Math" w:hAnsi="Cambria Math"/>
-              </w:rPr>
-              <m:t>gof</m:t>
-            </m:r>
-          </m:e>
-        </m:d>
-        <m:d>
-          <m:dPr>
-            <m:ctrlPr>
-              <w:rPr>
-                <w:rFonts w:ascii="Cambria Math" w:hAnsi="Cambria Math"/>
-                <w:i/>
-              </w:rPr>
-            </m:ctrlPr>
-          </m:dPr>
-          <m:e>
-            <m:r>
-              <w:rPr>
-                <w:rFonts w:ascii="Cambria Math" w:hAnsi="Cambria Math"/>
-              </w:rPr>
-              <m:t>x</m:t>
-            </m:r>
-          </m:e>
-        </m:d>
-        <m:r>
-          <w:rPr>
-            <w:rFonts w:ascii="Cambria Math" w:hAnsi="Cambria Math"/>
-          </w:rPr>
-          <m:t>=g</m:t>
-        </m:r>
-        <m:d>
-          <m:dPr>
-            <m:ctrlPr>
-              <w:rPr>
-                <w:rFonts w:ascii="Cambria Math" w:hAnsi="Cambria Math"/>
-                <w:i/>
-              </w:rPr>
-            </m:ctrlPr>
-          </m:dPr>
-          <m:e>
-            <m:r>
-              <w:rPr>
-                <w:rFonts w:ascii="Cambria Math" w:hAnsi="Cambria Math"/>
-              </w:rPr>
-              <m:t>f</m:t>
-            </m:r>
-            <m:d>
-              <m:dPr>
-                <m:ctrlPr>
-                  <w:rPr>
-                    <w:rFonts w:ascii="Cambria Math" w:hAnsi="Cambria Math"/>
-                    <w:i/>
-                  </w:rPr>
-                </m:ctrlPr>
-              </m:dPr>
-              <m:e>
-                <m:r>
-                  <w:rPr>
-                    <w:rFonts w:ascii="Cambria Math" w:hAnsi="Cambria Math"/>
-                  </w:rPr>
-                  <m:t>x</m:t>
-                </m:r>
-              </m:e>
-            </m:d>
+                <w:rFonts w:ascii="Cambria Math" w:eastAsiaTheme="minorEastAsia" w:hAnsi="Cambria Math"/>
+              </w:rPr>
+              <m:t>x+5</m:t>
+            </m:r>
           </m:e>
         </m:d>
         <m:r>
@@ -609,7 +555,7 @@
               <w:rPr>
                 <w:rFonts w:ascii="Cambria Math" w:eastAsiaTheme="minorEastAsia" w:hAnsi="Cambria Math"/>
               </w:rPr>
-              <m:t>4x</m:t>
+              <m:t>x</m:t>
             </m:r>
           </m:e>
           <m:sup>
@@ -625,7 +571,7 @@
           <w:rPr>
             <w:rFonts w:ascii="Cambria Math" w:eastAsiaTheme="minorEastAsia" w:hAnsi="Cambria Math"/>
           </w:rPr>
-          <m:t>+12x+7</m:t>
+          <m:t>+4x-3</m:t>
         </m:r>
       </m:oMath>
     </w:p>
@@ -637,12 +583,32 @@
         </w:rPr>
       </w:pPr>
       <m:oMath>
-        <m:r>
-          <w:rPr>
-            <w:rFonts w:ascii="Cambria Math" w:eastAsiaTheme="minorEastAsia" w:hAnsi="Cambria Math"/>
-          </w:rPr>
-          <m:t>g</m:t>
-        </m:r>
+        <m:sSup>
+          <m:sSupPr>
+            <m:ctrlPr>
+              <w:rPr>
+                <w:rFonts w:ascii="Cambria Math" w:eastAsiaTheme="minorEastAsia" w:hAnsi="Cambria Math"/>
+                <w:i/>
+              </w:rPr>
+            </m:ctrlPr>
+          </m:sSupPr>
+          <m:e>
+            <m:r>
+              <w:rPr>
+                <w:rFonts w:ascii="Cambria Math" w:eastAsiaTheme="minorEastAsia" w:hAnsi="Cambria Math"/>
+              </w:rPr>
+              <m:t>f</m:t>
+            </m:r>
+          </m:e>
+          <m:sup>
+            <m:r>
+              <w:rPr>
+                <w:rFonts w:ascii="Cambria Math" w:eastAsiaTheme="minorEastAsia" w:hAnsi="Cambria Math"/>
+              </w:rPr>
+              <m:t>-1</m:t>
+            </m:r>
+          </m:sup>
+        </m:sSup>
         <m:d>
           <m:dPr>
             <m:ctrlPr>
@@ -657,7 +623,53 @@
               <w:rPr>
                 <w:rFonts w:ascii="Cambria Math" w:eastAsiaTheme="minorEastAsia" w:hAnsi="Cambria Math"/>
               </w:rPr>
-              <m:t>2x+3</m:t>
+              <m:t>2a-3</m:t>
+            </m:r>
+          </m:e>
+        </m:d>
+        <m:r>
+          <w:rPr>
+            <w:rFonts w:ascii="Cambria Math" w:eastAsiaTheme="minorEastAsia" w:hAnsi="Cambria Math"/>
+          </w:rPr>
+          <m:t>=6</m:t>
+        </m:r>
+      </m:oMath>
+      <w:r>
+        <w:rPr>
+          <w:rFonts w:eastAsiaTheme="minorEastAsia"/>
+        </w:rPr>
+        <w:t xml:space="preserve"> </w:t>
+      </w:r>
+    </w:p>
+    <w:p>
+      <w:pPr>
+        <w:pStyle w:val="ListParagraph"/>
+        <w:rPr>
+          <w:rFonts w:eastAsiaTheme="minorEastAsia"/>
+        </w:rPr>
+      </w:pPr>
+      <m:oMath>
+        <m:r>
+          <w:rPr>
+            <w:rFonts w:ascii="Cambria Math" w:eastAsiaTheme="minorEastAsia" w:hAnsi="Cambria Math"/>
+          </w:rPr>
+          <m:t>f</m:t>
+        </m:r>
+        <m:d>
+          <m:dPr>
+            <m:ctrlPr>
+              <w:rPr>
+                <w:rFonts w:ascii="Cambria Math" w:eastAsiaTheme="minorEastAsia" w:hAnsi="Cambria Math"/>
+                <w:i/>
+              </w:rPr>
+            </m:ctrlPr>
+          </m:dPr>
+          <m:e>
+            <m:r>
+              <w:rPr>
+                <w:rFonts w:ascii="Cambria Math" w:eastAsiaTheme="minorEastAsia" w:hAnsi="Cambria Math"/>
+              </w:rPr>
+              <m:t>x</m:t>
             </m:r>
           </m:e>
         </m:d>
@@ -681,7 +693,7 @@
               <w:rPr>
                 <w:rFonts w:ascii="Cambria Math" w:eastAsiaTheme="minorEastAsia" w:hAnsi="Cambria Math"/>
               </w:rPr>
-              <m:t>4x</m:t>
+              <m:t>f</m:t>
             </m:r>
           </m:e>
           <m:sup>
@@ -689,7 +701,7 @@
               <w:rPr>
                 <w:rFonts w:ascii="Cambria Math" w:eastAsiaTheme="minorEastAsia" w:hAnsi="Cambria Math"/>
               </w:rPr>
-              <m:t>2</m:t>
+              <m:t>-1</m:t>
             </m:r>
           </m:sup>
         </m:sSup>
@@ -697,7 +709,7 @@
           <w:rPr>
             <w:rFonts w:ascii="Cambria Math" w:eastAsiaTheme="minorEastAsia" w:hAnsi="Cambria Math"/>
           </w:rPr>
-          <m:t>+12x+7</m:t>
+          <m:t>(a)</m:t>
         </m:r>
       </m:oMath>
       <w:r>
@@ -714,60 +726,44 @@
           <w:rFonts w:eastAsiaTheme="minorEastAsia"/>
         </w:rPr>
       </w:pPr>
-      <w:r>
-        <w:rPr>
-          <w:rFonts w:eastAsiaTheme="minorEastAsia"/>
-        </w:rPr>
-        <w:t xml:space="preserve">Misal t = 2x+3, </w:t>
-      </w:r>
-      <w:proofErr w:type="spellStart"/>
-      <w:r>
-        <w:rPr>
-          <w:rFonts w:eastAsiaTheme="minorEastAsia"/>
-        </w:rPr>
-        <w:t>maka</w:t>
-      </w:r>
-      <w:proofErr w:type="spellEnd"/>
-      <w:r>
-        <w:rPr>
-          <w:rFonts w:eastAsiaTheme="minorEastAsia"/>
-        </w:rPr>
-        <w:t xml:space="preserve"> 2x=t-3 </w:t>
-      </w:r>
       <m:oMath>
         <m:r>
           <w:rPr>
             <w:rFonts w:ascii="Cambria Math" w:eastAsiaTheme="minorEastAsia" w:hAnsi="Cambria Math"/>
           </w:rPr>
-          <m:t>x=</m:t>
-        </m:r>
-        <m:f>
-          <m:fPr>
-            <m:ctrlPr>
-              <w:rPr>
-                <w:rFonts w:ascii="Cambria Math" w:eastAsiaTheme="minorEastAsia" w:hAnsi="Cambria Math"/>
-                <w:i/>
-              </w:rPr>
-            </m:ctrlPr>
-          </m:fPr>
-          <m:num>
-            <m:r>
-              <w:rPr>
-                <w:rFonts w:ascii="Cambria Math" w:eastAsiaTheme="minorEastAsia" w:hAnsi="Cambria Math"/>
-              </w:rPr>
-              <m:t>t-3</m:t>
-            </m:r>
-          </m:num>
-          <m:den>
-            <m:r>
-              <w:rPr>
-                <w:rFonts w:ascii="Cambria Math" w:eastAsiaTheme="minorEastAsia" w:hAnsi="Cambria Math"/>
-              </w:rPr>
-              <m:t>2</m:t>
-            </m:r>
-          </m:den>
-        </m:f>
+          <m:t>f</m:t>
+        </m:r>
+        <m:d>
+          <m:dPr>
+            <m:ctrlPr>
+              <w:rPr>
+                <w:rFonts w:ascii="Cambria Math" w:eastAsiaTheme="minorEastAsia" w:hAnsi="Cambria Math"/>
+                <w:i/>
+              </w:rPr>
+            </m:ctrlPr>
+          </m:dPr>
+          <m:e>
+            <m:r>
+              <w:rPr>
+                <w:rFonts w:ascii="Cambria Math" w:eastAsiaTheme="minorEastAsia" w:hAnsi="Cambria Math"/>
+              </w:rPr>
+              <m:t>6</m:t>
+            </m:r>
+          </m:e>
+        </m:d>
+        <m:r>
+          <w:rPr>
+            <w:rFonts w:ascii="Cambria Math" w:eastAsiaTheme="minorEastAsia" w:hAnsi="Cambria Math"/>
+          </w:rPr>
+          <m:t>=x+5;berarti nilai x=1</m:t>
+        </m:r>
       </m:oMath>
+      <w:r>
+        <w:rPr>
+          <w:rFonts w:eastAsiaTheme="minorEastAsia"/>
+        </w:rPr>
+        <w:t xml:space="preserve"> </w:t>
+      </w:r>
     </w:p>
     <w:p>
       <w:pPr>
@@ -776,78 +772,100 @@
           <w:rFonts w:eastAsiaTheme="minorEastAsia"/>
         </w:rPr>
       </w:pPr>
-      <w:proofErr w:type="spellStart"/>
-      <w:r>
-        <w:rPr>
-          <w:rFonts w:eastAsiaTheme="minorEastAsia"/>
-        </w:rPr>
-        <w:t>Subtitusikan</w:t>
-      </w:r>
-      <w:proofErr w:type="spellEnd"/>
-      <w:r>
-        <w:rPr>
-          <w:rFonts w:eastAsiaTheme="minorEastAsia"/>
-        </w:rPr>
-        <w:t xml:space="preserve"> </w:t>
-      </w:r>
-      <w:proofErr w:type="spellStart"/>
-      <w:r>
-        <w:rPr>
-          <w:rFonts w:eastAsiaTheme="minorEastAsia"/>
-        </w:rPr>
-        <w:t>nilai</w:t>
-      </w:r>
-      <w:proofErr w:type="spellEnd"/>
-      <w:r>
-        <w:rPr>
-          <w:rFonts w:eastAsiaTheme="minorEastAsia"/>
-        </w:rPr>
-        <w:t xml:space="preserve"> x </w:t>
-      </w:r>
-      <w:proofErr w:type="spellStart"/>
-      <w:r>
-        <w:rPr>
-          <w:rFonts w:eastAsiaTheme="minorEastAsia"/>
-        </w:rPr>
-        <w:t>ke</w:t>
-      </w:r>
-      <w:proofErr w:type="spellEnd"/>
-      <w:r>
-        <w:rPr>
-          <w:rFonts w:eastAsiaTheme="minorEastAsia"/>
-        </w:rPr>
-        <w:t xml:space="preserve"> </w:t>
-      </w:r>
-      <w:proofErr w:type="spellStart"/>
-      <w:r>
-        <w:rPr>
-          <w:rFonts w:eastAsiaTheme="minorEastAsia"/>
-        </w:rPr>
-        <w:t>persamaan</w:t>
-      </w:r>
-      <w:proofErr w:type="spellEnd"/>
-      <w:r>
-        <w:rPr>
-          <w:rFonts w:eastAsiaTheme="minorEastAsia"/>
-        </w:rPr>
-        <w:t xml:space="preserve"> </w:t>
-      </w:r>
-      <w:proofErr w:type="spellStart"/>
-      <w:proofErr w:type="gramStart"/>
-      <w:r>
-        <w:rPr>
-          <w:rFonts w:eastAsiaTheme="minorEastAsia"/>
-        </w:rPr>
-        <w:t>kanan</w:t>
-      </w:r>
-      <w:proofErr w:type="spellEnd"/>
-      <w:r>
-        <w:rPr>
-          <w:rFonts w:eastAsiaTheme="minorEastAsia"/>
-        </w:rPr>
-        <w:t xml:space="preserve"> :</w:t>
-      </w:r>
-      <w:proofErr w:type="gramEnd"/>
+      <m:oMath>
+        <m:r>
+          <w:rPr>
+            <w:rFonts w:ascii="Cambria Math" w:eastAsiaTheme="minorEastAsia" w:hAnsi="Cambria Math"/>
+          </w:rPr>
+          <m:t>f</m:t>
+        </m:r>
+        <m:d>
+          <m:dPr>
+            <m:ctrlPr>
+              <w:rPr>
+                <w:rFonts w:ascii="Cambria Math" w:eastAsiaTheme="minorEastAsia" w:hAnsi="Cambria Math"/>
+                <w:i/>
+              </w:rPr>
+            </m:ctrlPr>
+          </m:dPr>
+          <m:e>
+            <m:r>
+              <w:rPr>
+                <w:rFonts w:ascii="Cambria Math" w:eastAsiaTheme="minorEastAsia" w:hAnsi="Cambria Math"/>
+              </w:rPr>
+              <m:t>6</m:t>
+            </m:r>
+          </m:e>
+        </m:d>
+        <m:r>
+          <w:rPr>
+            <w:rFonts w:ascii="Cambria Math" w:eastAsiaTheme="minorEastAsia" w:hAnsi="Cambria Math"/>
+          </w:rPr>
+          <m:t>=</m:t>
+        </m:r>
+        <m:sSup>
+          <m:sSupPr>
+            <m:ctrlPr>
+              <w:rPr>
+                <w:rFonts w:ascii="Cambria Math" w:eastAsiaTheme="minorEastAsia" w:hAnsi="Cambria Math"/>
+                <w:i/>
+              </w:rPr>
+            </m:ctrlPr>
+          </m:sSupPr>
+          <m:e>
+            <m:r>
+              <w:rPr>
+                <w:rFonts w:ascii="Cambria Math" w:eastAsiaTheme="minorEastAsia" w:hAnsi="Cambria Math"/>
+              </w:rPr>
+              <m:t>(1)</m:t>
+            </m:r>
+          </m:e>
+          <m:sup>
+            <m:r>
+              <w:rPr>
+                <w:rFonts w:ascii="Cambria Math" w:eastAsiaTheme="minorEastAsia" w:hAnsi="Cambria Math"/>
+              </w:rPr>
+              <m:t>2</m:t>
+            </m:r>
+          </m:sup>
+        </m:sSup>
+        <m:r>
+          <w:rPr>
+            <w:rFonts w:ascii="Cambria Math" w:eastAsiaTheme="minorEastAsia" w:hAnsi="Cambria Math"/>
+          </w:rPr>
+          <m:t>+4</m:t>
+        </m:r>
+        <m:d>
+          <m:dPr>
+            <m:ctrlPr>
+              <w:rPr>
+                <w:rFonts w:ascii="Cambria Math" w:eastAsiaTheme="minorEastAsia" w:hAnsi="Cambria Math"/>
+                <w:i/>
+              </w:rPr>
+            </m:ctrlPr>
+          </m:dPr>
+          <m:e>
+            <m:r>
+              <w:rPr>
+                <w:rFonts w:ascii="Cambria Math" w:eastAsiaTheme="minorEastAsia" w:hAnsi="Cambria Math"/>
+              </w:rPr>
+              <m:t>1</m:t>
+            </m:r>
+          </m:e>
+        </m:d>
+        <m:r>
+          <w:rPr>
+            <w:rFonts w:ascii="Cambria Math" w:eastAsiaTheme="minorEastAsia" w:hAnsi="Cambria Math"/>
+          </w:rPr>
+          <m:t>-3</m:t>
+        </m:r>
+      </m:oMath>
+      <w:r>
+        <w:rPr>
+          <w:rFonts w:eastAsiaTheme="minorEastAsia"/>
+        </w:rPr>
+        <w:t xml:space="preserve"> </w:t>
+      </w:r>
     </w:p>
     <w:p>
       <w:pPr>
@@ -861,7 +879,7 @@
           <w:rPr>
             <w:rFonts w:ascii="Cambria Math" w:eastAsiaTheme="minorEastAsia" w:hAnsi="Cambria Math"/>
           </w:rPr>
-          <m:t>g</m:t>
+          <m:t>f</m:t>
         </m:r>
         <m:d>
           <m:dPr>
@@ -877,7 +895,7 @@
               <w:rPr>
                 <w:rFonts w:ascii="Cambria Math" w:eastAsiaTheme="minorEastAsia" w:hAnsi="Cambria Math"/>
               </w:rPr>
-              <m:t>t</m:t>
+              <m:t>6</m:t>
             </m:r>
           </m:e>
         </m:d>
@@ -885,8 +903,70 @@
           <w:rPr>
             <w:rFonts w:ascii="Cambria Math" w:eastAsiaTheme="minorEastAsia" w:hAnsi="Cambria Math"/>
           </w:rPr>
-          <m:t>=4</m:t>
-        </m:r>
+          <m:t>=1+4-3</m:t>
+        </m:r>
+      </m:oMath>
+      <w:r>
+        <w:rPr>
+          <w:rFonts w:eastAsiaTheme="minorEastAsia"/>
+        </w:rPr>
+        <w:t xml:space="preserve"> </w:t>
+      </w:r>
+    </w:p>
+    <w:p>
+      <w:pPr>
+        <w:pStyle w:val="ListParagraph"/>
+        <w:rPr>
+          <w:rFonts w:eastAsiaTheme="minorEastAsia"/>
+        </w:rPr>
+      </w:pPr>
+      <m:oMath>
+        <m:r>
+          <w:rPr>
+            <w:rFonts w:ascii="Cambria Math" w:eastAsiaTheme="minorEastAsia" w:hAnsi="Cambria Math"/>
+          </w:rPr>
+          <m:t>f</m:t>
+        </m:r>
+        <m:d>
+          <m:dPr>
+            <m:ctrlPr>
+              <w:rPr>
+                <w:rFonts w:ascii="Cambria Math" w:eastAsiaTheme="minorEastAsia" w:hAnsi="Cambria Math"/>
+                <w:i/>
+              </w:rPr>
+            </m:ctrlPr>
+          </m:dPr>
+          <m:e>
+            <m:r>
+              <w:rPr>
+                <w:rFonts w:ascii="Cambria Math" w:eastAsiaTheme="minorEastAsia" w:hAnsi="Cambria Math"/>
+              </w:rPr>
+              <m:t>6</m:t>
+            </m:r>
+          </m:e>
+        </m:d>
+        <m:r>
+          <w:rPr>
+            <w:rFonts w:ascii="Cambria Math" w:eastAsiaTheme="minorEastAsia" w:hAnsi="Cambria Math"/>
+          </w:rPr>
+          <m:t>=2</m:t>
+        </m:r>
+      </m:oMath>
+      <w:r>
+        <w:rPr>
+          <w:rFonts w:eastAsiaTheme="minorEastAsia"/>
+        </w:rPr>
+        <w:t xml:space="preserve"> </w:t>
+      </w:r>
+    </w:p>
+    <w:p>
+      <w:pPr>
+        <w:pStyle w:val="ListParagraph"/>
+        <w:rPr>
+          <w:rFonts w:eastAsiaTheme="minorEastAsia"/>
+        </w:rPr>
+      </w:pPr>
+      <m:oMath>
         <m:sSup>
           <m:sSupPr>
             <m:ctrlPr>
@@ -897,60 +977,22 @@
             </m:ctrlPr>
           </m:sSupPr>
           <m:e>
-            <m:d>
-              <m:dPr>
-                <m:ctrlPr>
-                  <w:rPr>
-                    <w:rFonts w:ascii="Cambria Math" w:eastAsiaTheme="minorEastAsia" w:hAnsi="Cambria Math"/>
-                    <w:i/>
-                  </w:rPr>
-                </m:ctrlPr>
-              </m:dPr>
-              <m:e>
-                <m:f>
-                  <m:fPr>
-                    <m:ctrlPr>
-                      <w:rPr>
-                        <w:rFonts w:ascii="Cambria Math" w:eastAsiaTheme="minorEastAsia" w:hAnsi="Cambria Math"/>
-                        <w:i/>
-                      </w:rPr>
-                    </m:ctrlPr>
-                  </m:fPr>
-                  <m:num>
-                    <m:r>
-                      <w:rPr>
-                        <w:rFonts w:ascii="Cambria Math" w:eastAsiaTheme="minorEastAsia" w:hAnsi="Cambria Math"/>
-                      </w:rPr>
-                      <m:t>t-3</m:t>
-                    </m:r>
-                  </m:num>
-                  <m:den>
-                    <m:r>
-                      <w:rPr>
-                        <w:rFonts w:ascii="Cambria Math" w:eastAsiaTheme="minorEastAsia" w:hAnsi="Cambria Math"/>
-                      </w:rPr>
-                      <m:t>2</m:t>
-                    </m:r>
-                  </m:den>
-                </m:f>
-              </m:e>
-            </m:d>
+            <m:r>
+              <w:rPr>
+                <w:rFonts w:ascii="Cambria Math" w:eastAsiaTheme="minorEastAsia" w:hAnsi="Cambria Math"/>
+              </w:rPr>
+              <m:t>f</m:t>
+            </m:r>
           </m:e>
           <m:sup>
             <m:r>
               <w:rPr>
                 <w:rFonts w:ascii="Cambria Math" w:eastAsiaTheme="minorEastAsia" w:hAnsi="Cambria Math"/>
               </w:rPr>
-              <m:t>2</m:t>
+              <m:t>-1</m:t>
             </m:r>
           </m:sup>
         </m:sSup>
-        <m:r>
-          <w:rPr>
-            <w:rFonts w:ascii="Cambria Math" w:eastAsiaTheme="minorEastAsia" w:hAnsi="Cambria Math"/>
-          </w:rPr>
-          <m:t>+12</m:t>
-        </m:r>
         <m:d>
           <m:dPr>
             <m:ctrlPr>
@@ -961,39 +1003,43 @@
             </m:ctrlPr>
           </m:dPr>
           <m:e>
-            <m:f>
-              <m:fPr>
-                <m:ctrlPr>
-                  <w:rPr>
-                    <w:rFonts w:ascii="Cambria Math" w:eastAsiaTheme="minorEastAsia" w:hAnsi="Cambria Math"/>
-                    <w:i/>
-                  </w:rPr>
-                </m:ctrlPr>
-              </m:fPr>
-              <m:num>
-                <m:r>
-                  <w:rPr>
-                    <w:rFonts w:ascii="Cambria Math" w:eastAsiaTheme="minorEastAsia" w:hAnsi="Cambria Math"/>
-                  </w:rPr>
-                  <m:t>t-3</m:t>
-                </m:r>
-              </m:num>
-              <m:den>
-                <m:r>
-                  <w:rPr>
-                    <w:rFonts w:ascii="Cambria Math" w:eastAsiaTheme="minorEastAsia" w:hAnsi="Cambria Math"/>
-                  </w:rPr>
-                  <m:t>2</m:t>
-                </m:r>
-              </m:den>
-            </m:f>
+            <m:r>
+              <w:rPr>
+                <w:rFonts w:ascii="Cambria Math" w:eastAsiaTheme="minorEastAsia" w:hAnsi="Cambria Math"/>
+              </w:rPr>
+              <m:t>2a-3</m:t>
+            </m:r>
           </m:e>
         </m:d>
         <m:r>
           <w:rPr>
             <w:rFonts w:ascii="Cambria Math" w:eastAsiaTheme="minorEastAsia" w:hAnsi="Cambria Math"/>
           </w:rPr>
-          <m:t>+7</m:t>
+          <m:t>=f</m:t>
+        </m:r>
+        <m:d>
+          <m:dPr>
+            <m:ctrlPr>
+              <w:rPr>
+                <w:rFonts w:ascii="Cambria Math" w:eastAsiaTheme="minorEastAsia" w:hAnsi="Cambria Math"/>
+                <w:i/>
+              </w:rPr>
+            </m:ctrlPr>
+          </m:dPr>
+          <m:e>
+            <m:r>
+              <w:rPr>
+                <w:rFonts w:ascii="Cambria Math" w:eastAsiaTheme="minorEastAsia" w:hAnsi="Cambria Math"/>
+              </w:rPr>
+              <m:t>6</m:t>
+            </m:r>
+          </m:e>
+        </m:d>
+        <m:r>
+          <w:rPr>
+            <w:rFonts w:ascii="Cambria Math" w:eastAsiaTheme="minorEastAsia" w:hAnsi="Cambria Math"/>
+          </w:rPr>
+          <m:t>;maka</m:t>
         </m:r>
       </m:oMath>
       <w:r>
@@ -1015,125 +1061,7 @@
           <w:rPr>
             <w:rFonts w:ascii="Cambria Math" w:eastAsiaTheme="minorEastAsia" w:hAnsi="Cambria Math"/>
           </w:rPr>
-          <m:t>g</m:t>
-        </m:r>
-        <m:d>
-          <m:dPr>
-            <m:ctrlPr>
-              <w:rPr>
-                <w:rFonts w:ascii="Cambria Math" w:eastAsiaTheme="minorEastAsia" w:hAnsi="Cambria Math"/>
-                <w:i/>
-              </w:rPr>
-            </m:ctrlPr>
-          </m:dPr>
-          <m:e>
-            <m:r>
-              <w:rPr>
-                <w:rFonts w:ascii="Cambria Math" w:eastAsiaTheme="minorEastAsia" w:hAnsi="Cambria Math"/>
-              </w:rPr>
-              <m:t>t</m:t>
-            </m:r>
-          </m:e>
-        </m:d>
-        <m:r>
-          <w:rPr>
-            <w:rFonts w:ascii="Cambria Math" w:eastAsiaTheme="minorEastAsia" w:hAnsi="Cambria Math"/>
-          </w:rPr>
-          <m:t>=4</m:t>
-        </m:r>
-        <m:d>
-          <m:dPr>
-            <m:ctrlPr>
-              <w:rPr>
-                <w:rFonts w:ascii="Cambria Math" w:eastAsiaTheme="minorEastAsia" w:hAnsi="Cambria Math"/>
-                <w:i/>
-              </w:rPr>
-            </m:ctrlPr>
-          </m:dPr>
-          <m:e>
-            <m:f>
-              <m:fPr>
-                <m:ctrlPr>
-                  <w:rPr>
-                    <w:rFonts w:ascii="Cambria Math" w:eastAsiaTheme="minorEastAsia" w:hAnsi="Cambria Math"/>
-                    <w:i/>
-                  </w:rPr>
-                </m:ctrlPr>
-              </m:fPr>
-              <m:num>
-                <m:sSup>
-                  <m:sSupPr>
-                    <m:ctrlPr>
-                      <w:rPr>
-                        <w:rFonts w:ascii="Cambria Math" w:eastAsiaTheme="minorEastAsia" w:hAnsi="Cambria Math"/>
-                        <w:i/>
-                      </w:rPr>
-                    </m:ctrlPr>
-                  </m:sSupPr>
-                  <m:e>
-                    <m:r>
-                      <w:rPr>
-                        <w:rFonts w:ascii="Cambria Math" w:eastAsiaTheme="minorEastAsia" w:hAnsi="Cambria Math"/>
-                      </w:rPr>
-                      <m:t>t</m:t>
-                    </m:r>
-                  </m:e>
-                  <m:sup>
-                    <m:r>
-                      <w:rPr>
-                        <w:rFonts w:ascii="Cambria Math" w:eastAsiaTheme="minorEastAsia" w:hAnsi="Cambria Math"/>
-                      </w:rPr>
-                      <m:t>2</m:t>
-                    </m:r>
-                  </m:sup>
-                </m:sSup>
-                <m:r>
-                  <w:rPr>
-                    <w:rFonts w:ascii="Cambria Math" w:eastAsiaTheme="minorEastAsia" w:hAnsi="Cambria Math"/>
-                  </w:rPr>
-                  <m:t>-6t+9</m:t>
-                </m:r>
-              </m:num>
-              <m:den>
-                <m:r>
-                  <w:rPr>
-                    <w:rFonts w:ascii="Cambria Math" w:eastAsiaTheme="minorEastAsia" w:hAnsi="Cambria Math"/>
-                  </w:rPr>
-                  <m:t>4</m:t>
-                </m:r>
-              </m:den>
-            </m:f>
-          </m:e>
-        </m:d>
-        <m:r>
-          <w:rPr>
-            <w:rFonts w:ascii="Cambria Math" w:eastAsiaTheme="minorEastAsia" w:hAnsi="Cambria Math"/>
-          </w:rPr>
-          <m:t>+6</m:t>
-        </m:r>
-        <m:d>
-          <m:dPr>
-            <m:ctrlPr>
-              <w:rPr>
-                <w:rFonts w:ascii="Cambria Math" w:eastAsiaTheme="minorEastAsia" w:hAnsi="Cambria Math"/>
-                <w:i/>
-              </w:rPr>
-            </m:ctrlPr>
-          </m:dPr>
-          <m:e>
-            <m:r>
-              <w:rPr>
-                <w:rFonts w:ascii="Cambria Math" w:eastAsiaTheme="minorEastAsia" w:hAnsi="Cambria Math"/>
-              </w:rPr>
-              <m:t>t-3</m:t>
-            </m:r>
-          </m:e>
-        </m:d>
-        <m:r>
-          <w:rPr>
-            <w:rFonts w:ascii="Cambria Math" w:eastAsiaTheme="minorEastAsia" w:hAnsi="Cambria Math"/>
-          </w:rPr>
-          <m:t>+7</m:t>
+          <m:t>2a-3=2</m:t>
         </m:r>
       </m:oMath>
       <w:r>
@@ -1155,63 +1083,7 @@
           <w:rPr>
             <w:rFonts w:ascii="Cambria Math" w:eastAsiaTheme="minorEastAsia" w:hAnsi="Cambria Math"/>
           </w:rPr>
-          <m:t>g</m:t>
-        </m:r>
-        <m:d>
-          <m:dPr>
-            <m:ctrlPr>
-              <w:rPr>
-                <w:rFonts w:ascii="Cambria Math" w:eastAsiaTheme="minorEastAsia" w:hAnsi="Cambria Math"/>
-                <w:i/>
-              </w:rPr>
-            </m:ctrlPr>
-          </m:dPr>
-          <m:e>
-            <m:r>
-              <w:rPr>
-                <w:rFonts w:ascii="Cambria Math" w:eastAsiaTheme="minorEastAsia" w:hAnsi="Cambria Math"/>
-              </w:rPr>
-              <m:t>t</m:t>
-            </m:r>
-          </m:e>
-        </m:d>
-        <m:r>
-          <w:rPr>
-            <w:rFonts w:ascii="Cambria Math" w:eastAsiaTheme="minorEastAsia" w:hAnsi="Cambria Math"/>
-          </w:rPr>
-          <m:t>=</m:t>
-        </m:r>
-        <m:sSup>
-          <m:sSupPr>
-            <m:ctrlPr>
-              <w:rPr>
-                <w:rFonts w:ascii="Cambria Math" w:eastAsiaTheme="minorEastAsia" w:hAnsi="Cambria Math"/>
-                <w:i/>
-              </w:rPr>
-            </m:ctrlPr>
-          </m:sSupPr>
-          <m:e>
-            <m:r>
-              <w:rPr>
-                <w:rFonts w:ascii="Cambria Math" w:eastAsiaTheme="minorEastAsia" w:hAnsi="Cambria Math"/>
-              </w:rPr>
-              <m:t>t</m:t>
-            </m:r>
-          </m:e>
-          <m:sup>
-            <m:r>
-              <w:rPr>
-                <w:rFonts w:ascii="Cambria Math" w:eastAsiaTheme="minorEastAsia" w:hAnsi="Cambria Math"/>
-              </w:rPr>
-              <m:t>2</m:t>
-            </m:r>
-          </m:sup>
-        </m:sSup>
-        <m:r>
-          <w:rPr>
-            <w:rFonts w:ascii="Cambria Math" w:eastAsiaTheme="minorEastAsia" w:hAnsi="Cambria Math"/>
-          </w:rPr>
-          <m:t>-6t+9+6t-18+7</m:t>
+          <m:t>2a=3+2</m:t>
         </m:r>
       </m:oMath>
       <w:r>
@@ -1233,63 +1105,7 @@
           <w:rPr>
             <w:rFonts w:ascii="Cambria Math" w:eastAsiaTheme="minorEastAsia" w:hAnsi="Cambria Math"/>
           </w:rPr>
-          <m:t>g</m:t>
-        </m:r>
-        <m:d>
-          <m:dPr>
-            <m:ctrlPr>
-              <w:rPr>
-                <w:rFonts w:ascii="Cambria Math" w:eastAsiaTheme="minorEastAsia" w:hAnsi="Cambria Math"/>
-                <w:i/>
-              </w:rPr>
-            </m:ctrlPr>
-          </m:dPr>
-          <m:e>
-            <m:r>
-              <w:rPr>
-                <w:rFonts w:ascii="Cambria Math" w:eastAsiaTheme="minorEastAsia" w:hAnsi="Cambria Math"/>
-              </w:rPr>
-              <m:t>t</m:t>
-            </m:r>
-          </m:e>
-        </m:d>
-        <m:r>
-          <w:rPr>
-            <w:rFonts w:ascii="Cambria Math" w:eastAsiaTheme="minorEastAsia" w:hAnsi="Cambria Math"/>
-          </w:rPr>
-          <m:t>=</m:t>
-        </m:r>
-        <m:sSup>
-          <m:sSupPr>
-            <m:ctrlPr>
-              <w:rPr>
-                <w:rFonts w:ascii="Cambria Math" w:eastAsiaTheme="minorEastAsia" w:hAnsi="Cambria Math"/>
-                <w:i/>
-              </w:rPr>
-            </m:ctrlPr>
-          </m:sSupPr>
-          <m:e>
-            <m:r>
-              <w:rPr>
-                <w:rFonts w:ascii="Cambria Math" w:eastAsiaTheme="minorEastAsia" w:hAnsi="Cambria Math"/>
-              </w:rPr>
-              <m:t>t</m:t>
-            </m:r>
-          </m:e>
-          <m:sup>
-            <m:r>
-              <w:rPr>
-                <w:rFonts w:ascii="Cambria Math" w:eastAsiaTheme="minorEastAsia" w:hAnsi="Cambria Math"/>
-              </w:rPr>
-              <m:t>2</m:t>
-            </m:r>
-          </m:sup>
-        </m:sSup>
-        <m:r>
-          <w:rPr>
-            <w:rFonts w:ascii="Cambria Math" w:eastAsiaTheme="minorEastAsia" w:hAnsi="Cambria Math"/>
-          </w:rPr>
-          <m:t>-2</m:t>
+          <m:t>2a=5;4a=10</m:t>
         </m:r>
       </m:oMath>
       <w:r>
@@ -1298,84 +1114,6 @@
         </w:rPr>
         <w:t xml:space="preserve"> </w:t>
       </w:r>
-    </w:p>
-    <w:p>
-      <w:pPr>
-        <w:pStyle w:val="ListParagraph"/>
-        <w:rPr>
-          <w:rFonts w:eastAsiaTheme="minorEastAsia"/>
-        </w:rPr>
-      </w:pPr>
-      <w:r>
-        <w:rPr>
-          <w:rFonts w:eastAsiaTheme="minorEastAsia"/>
-        </w:rPr>
-        <w:t xml:space="preserve">Jadi </w:t>
-      </w:r>
-      <m:oMath>
-        <m:r>
-          <w:rPr>
-            <w:rFonts w:ascii="Cambria Math" w:eastAsiaTheme="minorEastAsia" w:hAnsi="Cambria Math"/>
-          </w:rPr>
-          <m:t>g</m:t>
-        </m:r>
-        <m:d>
-          <m:dPr>
-            <m:ctrlPr>
-              <w:rPr>
-                <w:rFonts w:ascii="Cambria Math" w:eastAsiaTheme="minorEastAsia" w:hAnsi="Cambria Math"/>
-                <w:i/>
-              </w:rPr>
-            </m:ctrlPr>
-          </m:dPr>
-          <m:e>
-            <m:r>
-              <w:rPr>
-                <w:rFonts w:ascii="Cambria Math" w:eastAsiaTheme="minorEastAsia" w:hAnsi="Cambria Math"/>
-              </w:rPr>
-              <m:t>x</m:t>
-            </m:r>
-          </m:e>
-        </m:d>
-        <m:r>
-          <w:rPr>
-            <w:rFonts w:ascii="Cambria Math" w:eastAsiaTheme="minorEastAsia" w:hAnsi="Cambria Math"/>
-          </w:rPr>
-          <m:t>=</m:t>
-        </m:r>
-        <m:sSup>
-          <m:sSupPr>
-            <m:ctrlPr>
-              <w:rPr>
-                <w:rFonts w:ascii="Cambria Math" w:eastAsiaTheme="minorEastAsia" w:hAnsi="Cambria Math"/>
-                <w:i/>
-              </w:rPr>
-            </m:ctrlPr>
-          </m:sSupPr>
-          <m:e>
-            <m:r>
-              <w:rPr>
-                <w:rFonts w:ascii="Cambria Math" w:eastAsiaTheme="minorEastAsia" w:hAnsi="Cambria Math"/>
-              </w:rPr>
-              <m:t>x</m:t>
-            </m:r>
-          </m:e>
-          <m:sup>
-            <m:r>
-              <w:rPr>
-                <w:rFonts w:ascii="Cambria Math" w:eastAsiaTheme="minorEastAsia" w:hAnsi="Cambria Math"/>
-              </w:rPr>
-              <m:t>2</m:t>
-            </m:r>
-          </m:sup>
-        </m:sSup>
-        <m:r>
-          <w:rPr>
-            <w:rFonts w:ascii="Cambria Math" w:eastAsiaTheme="minorEastAsia" w:hAnsi="Cambria Math"/>
-          </w:rPr>
-          <m:t>-2</m:t>
-        </m:r>
-      </m:oMath>
     </w:p>
     <w:p>
       <w:pPr>
@@ -1392,14 +1130,14 @@
         <w:rPr>
           <w:rFonts w:eastAsiaTheme="minorEastAsia"/>
         </w:rPr>
-        <w:t xml:space="preserve">a. </w:t>
+        <w:t>a. m</w:t>
       </w:r>
       <w:proofErr w:type="spellStart"/>
       <w:r>
         <w:rPr>
           <w:rFonts w:eastAsiaTheme="minorEastAsia"/>
         </w:rPr>
-        <w:t>mencari</w:t>
+        <w:t>encari</w:t>
       </w:r>
       <w:proofErr w:type="spellEnd"/>
       <w:r>
@@ -3109,7 +2847,13 @@
           <w:rPr>
             <w:rFonts w:ascii="Cambria Math" w:eastAsiaTheme="minorEastAsia" w:hAnsi="Cambria Math"/>
           </w:rPr>
-          <m:t>y=3(5</m:t>
+          <m:t>y=3(</m:t>
+        </m:r>
+        <m:r>
+          <w:rPr>
+            <w:rFonts w:ascii="Cambria Math" w:eastAsiaTheme="minorEastAsia" w:hAnsi="Cambria Math"/>
+          </w:rPr>
+          <m:t>8</m:t>
         </m:r>
         <m:sSup>
           <m:sSupPr>
@@ -3157,7 +2901,7 @@
               <w:rPr>
                 <w:rFonts w:ascii="Cambria Math" w:eastAsiaTheme="minorEastAsia" w:hAnsi="Cambria Math"/>
               </w:rPr>
-              <m:t>5</m:t>
+              <m:t>8</m:t>
             </m:r>
           </m:e>
         </m:d>
@@ -3187,7 +2931,31 @@
           <w:rPr>
             <w:rFonts w:ascii="Cambria Math" w:eastAsiaTheme="minorEastAsia" w:hAnsi="Cambria Math"/>
           </w:rPr>
-          <m:t>y=75-30+5</m:t>
+          <m:t>y=</m:t>
+        </m:r>
+        <m:r>
+          <w:rPr>
+            <w:rFonts w:ascii="Cambria Math" w:eastAsiaTheme="minorEastAsia" w:hAnsi="Cambria Math"/>
+          </w:rPr>
+          <m:t>192</m:t>
+        </m:r>
+        <m:r>
+          <w:rPr>
+            <w:rFonts w:ascii="Cambria Math" w:eastAsiaTheme="minorEastAsia" w:hAnsi="Cambria Math"/>
+          </w:rPr>
+          <m:t>-</m:t>
+        </m:r>
+        <m:r>
+          <w:rPr>
+            <w:rFonts w:ascii="Cambria Math" w:eastAsiaTheme="minorEastAsia" w:hAnsi="Cambria Math"/>
+          </w:rPr>
+          <m:t>48</m:t>
+        </m:r>
+        <m:r>
+          <w:rPr>
+            <w:rFonts w:ascii="Cambria Math" w:eastAsiaTheme="minorEastAsia" w:hAnsi="Cambria Math"/>
+          </w:rPr>
+          <m:t>+5</m:t>
         </m:r>
       </m:oMath>
       <w:r>
@@ -3209,7 +2977,19 @@
           <w:rPr>
             <w:rFonts w:ascii="Cambria Math" w:eastAsiaTheme="minorEastAsia" w:hAnsi="Cambria Math"/>
           </w:rPr>
-          <m:t>y=50 ton</m:t>
+          <m:t>y=</m:t>
+        </m:r>
+        <m:r>
+          <w:rPr>
+            <w:rFonts w:ascii="Cambria Math" w:eastAsiaTheme="minorEastAsia" w:hAnsi="Cambria Math"/>
+          </w:rPr>
+          <m:t>149</m:t>
+        </m:r>
+        <m:r>
+          <w:rPr>
+            <w:rFonts w:ascii="Cambria Math" w:eastAsiaTheme="minorEastAsia" w:hAnsi="Cambria Math"/>
+          </w:rPr>
+          <m:t xml:space="preserve"> ton</m:t>
         </m:r>
       </m:oMath>
       <w:r>
@@ -3218,22 +2998,6 @@
         </w:rPr>
         <w:t xml:space="preserve"> </w:t>
       </w:r>
-    </w:p>
-    <w:p>
-      <w:pPr>
-        <w:pStyle w:val="ListParagraph"/>
-        <w:rPr>
-          <w:rFonts w:eastAsiaTheme="minorEastAsia"/>
-        </w:rPr>
-      </w:pPr>
-    </w:p>
-    <w:p>
-      <w:pPr>
-        <w:pStyle w:val="ListParagraph"/>
-        <w:rPr>
-          <w:rFonts w:eastAsiaTheme="minorEastAsia"/>
-        </w:rPr>
-      </w:pPr>
     </w:p>
     <w:sectPr>
       <w:pgSz w:w="11906" w:h="16838"/>
@@ -3945,6 +3709,7 @@
   <w:style w:type="character" w:default="1" w:styleId="DefaultParagraphFont">
     <w:name w:val="Default Paragraph Font"/>
     <w:uiPriority w:val="1"/>
+    <w:semiHidden/>
     <w:unhideWhenUsed/>
   </w:style>
   <w:style w:type="table" w:default="1" w:styleId="TableNormal">

</xml_diff>